<commit_message>
Updated naming and included co-owner in contract features
</commit_message>
<xml_diff>
--- a/data/templates/agreements/Master Line of Credit Agreement - VCG.docx
+++ b/data/templates/agreements/Master Line of Credit Agreement - VCG.docx
@@ -39,7 +39,7 @@
     <w:sdt>
       <w:sdtPr>
         <w:lock w:val="contentLocked"/>
-        <w:id w:val="-1123193590"/>
+        <w:id w:val="1380647562"/>
         <w:tag w:val="goog_rdk_0"/>
       </w:sdtPr>
       <w:sdtContent>
@@ -53,21 +53,21 @@
           </w:tblPr>
           <w:tblGrid>
             <w:gridCol w:w="1395"/>
-            <w:gridCol w:w="2715"/>
-            <w:gridCol w:w="885"/>
-            <w:gridCol w:w="1965"/>
-            <w:gridCol w:w="585"/>
-            <w:gridCol w:w="1005"/>
+            <w:gridCol w:w="2865"/>
+            <w:gridCol w:w="735"/>
+            <w:gridCol w:w="1995"/>
+            <w:gridCol w:w="450"/>
+            <w:gridCol w:w="1110"/>
             <w:gridCol w:w="585"/>
             <w:gridCol w:w="1545"/>
             <w:tblGridChange w:id="0">
               <w:tblGrid>
                 <w:gridCol w:w="1395"/>
-                <w:gridCol w:w="2715"/>
-                <w:gridCol w:w="885"/>
-                <w:gridCol w:w="1965"/>
-                <w:gridCol w:w="585"/>
-                <w:gridCol w:w="1005"/>
+                <w:gridCol w:w="2865"/>
+                <w:gridCol w:w="735"/>
+                <w:gridCol w:w="1995"/>
+                <w:gridCol w:w="450"/>
+                <w:gridCol w:w="1110"/>
                 <w:gridCol w:w="585"/>
                 <w:gridCol w:w="1545"/>
               </w:tblGrid>
@@ -402,7 +402,7 @@
     <w:sdt>
       <w:sdtPr>
         <w:lock w:val="contentLocked"/>
-        <w:id w:val="959737083"/>
+        <w:id w:val="-1134783859"/>
         <w:tag w:val="goog_rdk_1"/>
       </w:sdtPr>
       <w:sdtContent>
@@ -416,22 +416,22 @@
           </w:tblPr>
           <w:tblGrid>
             <w:gridCol w:w="1575"/>
-            <w:gridCol w:w="2535"/>
-            <w:gridCol w:w="885"/>
-            <w:gridCol w:w="1965"/>
-            <w:gridCol w:w="585"/>
-            <w:gridCol w:w="1005"/>
-            <w:gridCol w:w="585"/>
+            <w:gridCol w:w="2685"/>
+            <w:gridCol w:w="450"/>
+            <w:gridCol w:w="2280"/>
+            <w:gridCol w:w="555"/>
+            <w:gridCol w:w="1125"/>
+            <w:gridCol w:w="465"/>
             <w:gridCol w:w="1545"/>
             <w:tblGridChange w:id="0">
               <w:tblGrid>
                 <w:gridCol w:w="1575"/>
-                <w:gridCol w:w="2535"/>
-                <w:gridCol w:w="885"/>
-                <w:gridCol w:w="1965"/>
-                <w:gridCol w:w="585"/>
-                <w:gridCol w:w="1005"/>
-                <w:gridCol w:w="585"/>
+                <w:gridCol w:w="2685"/>
+                <w:gridCol w:w="450"/>
+                <w:gridCol w:w="2280"/>
+                <w:gridCol w:w="555"/>
+                <w:gridCol w:w="1125"/>
+                <w:gridCol w:w="465"/>
                 <w:gridCol w:w="1545"/>
               </w:tblGrid>
             </w:tblGridChange>
@@ -764,7 +764,7 @@
     <w:sdt>
       <w:sdtPr>
         <w:lock w:val="contentLocked"/>
-        <w:id w:val="1235094766"/>
+        <w:id w:val="209957565"/>
         <w:tag w:val="goog_rdk_2"/>
       </w:sdtPr>
       <w:sdtContent>
@@ -778,19 +778,19 @@
           </w:tblPr>
           <w:tblGrid>
             <w:gridCol w:w="540"/>
-            <w:gridCol w:w="3570"/>
-            <w:gridCol w:w="1590"/>
+            <w:gridCol w:w="3705"/>
+            <w:gridCol w:w="1455"/>
             <w:gridCol w:w="1305"/>
-            <w:gridCol w:w="1605"/>
-            <w:gridCol w:w="2055"/>
+            <w:gridCol w:w="1470"/>
+            <w:gridCol w:w="2190"/>
             <w:tblGridChange w:id="0">
               <w:tblGrid>
                 <w:gridCol w:w="540"/>
-                <w:gridCol w:w="3570"/>
-                <w:gridCol w:w="1590"/>
+                <w:gridCol w:w="3705"/>
+                <w:gridCol w:w="1455"/>
                 <w:gridCol w:w="1305"/>
-                <w:gridCol w:w="1605"/>
-                <w:gridCol w:w="2055"/>
+                <w:gridCol w:w="1470"/>
+                <w:gridCol w:w="2190"/>
               </w:tblGrid>
             </w:tblGridChange>
           </w:tblGrid>
@@ -1030,22 +1030,6 @@
     </w:sdt>
     <w:p>
       <w:pPr>
-        <w:widowControl w:val="0"/>
-        <w:spacing w:after="0" w:line="240" w:lineRule="auto"/>
-        <w:rPr>
-          <w:rFonts w:ascii="Arial" w:cs="Arial" w:eastAsia="Arial" w:hAnsi="Arial"/>
-          <w:sz w:val="18"/>
-          <w:szCs w:val="18"/>
-        </w:rPr>
-      </w:pPr>
-      <w:r>
-        <w:rPr>
-          <w:rtl w:val="0"/>
-        </w:rPr>
-      </w:r>
-    </w:p>
-    <w:p>
-      <w:pPr>
         <w:spacing w:after="0" w:line="240" w:lineRule="auto"/>
         <w:rPr>
           <w:rFonts w:ascii="Arial" w:cs="Arial" w:eastAsia="Arial" w:hAnsi="Arial"/>
@@ -1324,11 +1308,11 @@
     </w:p>
     <w:p>
       <w:pPr>
+        <w:spacing w:after="0" w:lineRule="auto"/>
         <w:jc w:val="both"/>
         <w:rPr>
-          <w:b w:val="1"/>
-          <w:sz w:val="10"/>
-          <w:szCs w:val="10"/>
+          <w:sz w:val="16"/>
+          <w:szCs w:val="16"/>
         </w:rPr>
       </w:pPr>
       <w:r>
@@ -1339,27 +1323,38 @@
     </w:p>
     <w:p>
       <w:pPr>
+        <w:spacing w:after="0" w:lineRule="auto"/>
         <w:jc w:val="both"/>
         <w:rPr>
-          <w:b w:val="1"/>
-          <w:sz w:val="10"/>
-          <w:szCs w:val="10"/>
+          <w:sz w:val="16"/>
+          <w:szCs w:val="16"/>
         </w:rPr>
       </w:pPr>
       <w:r>
         <w:rPr>
-          <w:b w:val="1"/>
-          <w:sz w:val="10"/>
-          <w:szCs w:val="10"/>
           <w:rtl w:val="0"/>
         </w:rPr>
-        <w:t xml:space="preserve">  </w:t>
+      </w:r>
+    </w:p>
+    <w:p>
+      <w:pPr>
+        <w:spacing w:after="0" w:lineRule="auto"/>
+        <w:jc w:val="both"/>
+        <w:rPr>
+          <w:sz w:val="16"/>
+          <w:szCs w:val="16"/>
+        </w:rPr>
+      </w:pPr>
+      <w:r>
+        <w:rPr>
+          <w:rtl w:val="0"/>
+        </w:rPr>
       </w:r>
     </w:p>
     <w:sdt>
       <w:sdtPr>
         <w:lock w:val="contentLocked"/>
-        <w:id w:val="-872445969"/>
+        <w:id w:val="1114832982"/>
         <w:tag w:val="goog_rdk_3"/>
       </w:sdtPr>
       <w:sdtContent>
@@ -1367,22 +1362,26 @@
           <w:tblPr>
             <w:tblStyle w:val="Table4"/>
             <w:tblpPr w:leftFromText="180" w:rightFromText="180" w:topFromText="180" w:bottomFromText="180" w:vertAnchor="text" w:horzAnchor="text" w:tblpX="0" w:tblpY="0"/>
-            <w:tblW w:w="10800.0" w:type="dxa"/>
+            <w:tblW w:w="10815.0" w:type="dxa"/>
             <w:jc w:val="left"/>
             <w:tblLayout w:type="fixed"/>
             <w:tblLook w:val="0600"/>
           </w:tblPr>
           <w:tblGrid>
-            <w:gridCol w:w="1320"/>
-            <w:gridCol w:w="4080"/>
-            <w:gridCol w:w="2700"/>
-            <w:gridCol w:w="2700"/>
+            <w:gridCol w:w="1755"/>
+            <w:gridCol w:w="2430"/>
+            <w:gridCol w:w="1035"/>
+            <w:gridCol w:w="3270"/>
+            <w:gridCol w:w="570"/>
+            <w:gridCol w:w="1755"/>
             <w:tblGridChange w:id="0">
               <w:tblGrid>
-                <w:gridCol w:w="1320"/>
-                <w:gridCol w:w="4080"/>
-                <w:gridCol w:w="2700"/>
-                <w:gridCol w:w="2700"/>
+                <w:gridCol w:w="1755"/>
+                <w:gridCol w:w="2430"/>
+                <w:gridCol w:w="1035"/>
+                <w:gridCol w:w="3270"/>
+                <w:gridCol w:w="570"/>
+                <w:gridCol w:w="1755"/>
               </w:tblGrid>
             </w:tblGridChange>
           </w:tblGrid>
@@ -1393,19 +1392,22 @@
             </w:trPr>
             <w:tc>
               <w:tcPr>
-                <w:tcMar>
-                  <w:top w:w="0.0" w:type="dxa"/>
-                  <w:left w:w="0.0" w:type="dxa"/>
-                  <w:bottom w:w="0.0" w:type="dxa"/>
-                  <w:right w:w="0.0" w:type="dxa"/>
-                </w:tcMar>
-                <w:vAlign w:val="bottom"/>
-              </w:tcPr>
-              <w:p>
-                <w:pPr>
-                  <w:widowControl w:val="0"/>
-                  <w:spacing w:after="0" w:line="240" w:lineRule="auto"/>
-                  <w:jc w:val="left"/>
+                <w:tcBorders>
+                  <w:bottom w:color="000000" w:space="0" w:sz="0" w:val="nil"/>
+                </w:tcBorders>
+                <w:tcMar>
+                  <w:top w:w="0.0" w:type="dxa"/>
+                  <w:left w:w="0.0" w:type="dxa"/>
+                  <w:bottom w:w="0.0" w:type="dxa"/>
+                  <w:right w:w="0.0" w:type="dxa"/>
+                </w:tcMar>
+                <w:vAlign w:val="bottom"/>
+              </w:tcPr>
+              <w:p>
+                <w:pPr>
+                  <w:widowControl w:val="0"/>
+                  <w:spacing w:after="0" w:line="240" w:lineRule="auto"/>
+                  <w:jc w:val="right"/>
                   <w:rPr>
                     <w:b w:val="1"/>
                     <w:sz w:val="24"/>
@@ -1414,29 +1416,12 @@
                 </w:pPr>
                 <w:r>
                   <w:rPr>
-                    <w:rtl w:val="0"/>
-                  </w:rPr>
-                </w:r>
-              </w:p>
-              <w:p>
-                <w:pPr>
-                  <w:widowControl w:val="0"/>
-                  <w:spacing w:after="0" w:line="240" w:lineRule="auto"/>
-                  <w:jc w:val="left"/>
-                  <w:rPr>
                     <w:b w:val="1"/>
                     <w:sz w:val="24"/>
                     <w:szCs w:val="24"/>
-                  </w:rPr>
-                </w:pPr>
-                <w:r>
-                  <w:rPr>
-                    <w:b w:val="1"/>
-                    <w:sz w:val="24"/>
-                    <w:szCs w:val="24"/>
-                    <w:rtl w:val="0"/>
-                  </w:rPr>
-                  <w:t xml:space="preserve">    Signature:</w:t>
+                    <w:rtl w:val="0"/>
+                  </w:rPr>
+                  <w:t xml:space="preserve">Owner Name:</w:t>
                 </w:r>
               </w:p>
             </w:tc>
@@ -1457,11 +1442,71 @@
                 <w:pPr>
                   <w:widowControl w:val="0"/>
                   <w:spacing w:after="0" w:line="240" w:lineRule="auto"/>
+                  <w:jc w:val="center"/>
+                  <w:rPr/>
+                </w:pPr>
+                <w:r>
+                  <w:rPr>
+                    <w:rtl w:val="0"/>
+                  </w:rPr>
+                  <w:t xml:space="preserve">{{OWNER_NAME}}</w:t>
+                </w:r>
+              </w:p>
+            </w:tc>
+            <w:tc>
+              <w:tcPr>
+                <w:tcBorders>
+                  <w:bottom w:color="000000" w:space="0" w:sz="0" w:val="nil"/>
+                </w:tcBorders>
+                <w:tcMar>
+                  <w:top w:w="0.0" w:type="dxa"/>
+                  <w:left w:w="0.0" w:type="dxa"/>
+                  <w:bottom w:w="0.0" w:type="dxa"/>
+                  <w:right w:w="0.0" w:type="dxa"/>
+                </w:tcMar>
+                <w:vAlign w:val="bottom"/>
+              </w:tcPr>
+              <w:p>
+                <w:pPr>
+                  <w:widowControl w:val="0"/>
+                  <w:spacing w:after="0" w:line="240" w:lineRule="auto"/>
+                  <w:jc w:val="right"/>
                   <w:rPr>
                     <w:b w:val="1"/>
                     <w:sz w:val="24"/>
                     <w:szCs w:val="24"/>
                   </w:rPr>
+                </w:pPr>
+                <w:r>
+                  <w:rPr>
+                    <w:b w:val="1"/>
+                    <w:sz w:val="24"/>
+                    <w:szCs w:val="24"/>
+                    <w:rtl w:val="0"/>
+                  </w:rPr>
+                  <w:t xml:space="preserve">Signature: </w:t>
+                </w:r>
+              </w:p>
+            </w:tc>
+            <w:tc>
+              <w:tcPr>
+                <w:tcBorders>
+                  <w:bottom w:color="000000" w:space="0" w:sz="8" w:val="single"/>
+                </w:tcBorders>
+                <w:tcMar>
+                  <w:top w:w="0.0" w:type="dxa"/>
+                  <w:left w:w="0.0" w:type="dxa"/>
+                  <w:bottom w:w="0.0" w:type="dxa"/>
+                  <w:right w:w="0.0" w:type="dxa"/>
+                </w:tcMar>
+                <w:vAlign w:val="bottom"/>
+              </w:tcPr>
+              <w:p>
+                <w:pPr>
+                  <w:widowControl w:val="0"/>
+                  <w:spacing w:after="0" w:line="240" w:lineRule="auto"/>
+                  <w:jc w:val="center"/>
+                  <w:rPr/>
                 </w:pPr>
                 <w:r>
                   <w:rPr>
@@ -1603,6 +1648,66 @@
             </w:tc>
             <w:tc>
               <w:tcPr>
+                <w:tcBorders>
+                  <w:top w:color="000000" w:space="0" w:sz="0" w:val="nil"/>
+                </w:tcBorders>
+                <w:tcMar>
+                  <w:top w:w="0.0" w:type="dxa"/>
+                  <w:left w:w="0.0" w:type="dxa"/>
+                  <w:bottom w:w="0.0" w:type="dxa"/>
+                  <w:right w:w="0.0" w:type="dxa"/>
+                </w:tcMar>
+                <w:vAlign w:val="bottom"/>
+              </w:tcPr>
+              <w:p>
+                <w:pPr>
+                  <w:widowControl w:val="0"/>
+                  <w:spacing w:after="0" w:line="240" w:lineRule="auto"/>
+                  <w:rPr>
+                    <w:b w:val="1"/>
+                    <w:sz w:val="24"/>
+                    <w:szCs w:val="24"/>
+                  </w:rPr>
+                </w:pPr>
+                <w:r>
+                  <w:rPr>
+                    <w:rtl w:val="0"/>
+                  </w:rPr>
+                </w:r>
+              </w:p>
+            </w:tc>
+            <w:tc>
+              <w:tcPr>
+                <w:tcBorders>
+                  <w:top w:color="000000" w:space="0" w:sz="8" w:val="single"/>
+                </w:tcBorders>
+                <w:tcMar>
+                  <w:top w:w="0.0" w:type="dxa"/>
+                  <w:left w:w="0.0" w:type="dxa"/>
+                  <w:bottom w:w="0.0" w:type="dxa"/>
+                  <w:right w:w="0.0" w:type="dxa"/>
+                </w:tcMar>
+                <w:vAlign w:val="bottom"/>
+              </w:tcPr>
+              <w:p>
+                <w:pPr>
+                  <w:widowControl w:val="0"/>
+                  <w:spacing w:after="0" w:line="240" w:lineRule="auto"/>
+                  <w:rPr>
+                    <w:b w:val="1"/>
+                    <w:sz w:val="24"/>
+                    <w:szCs w:val="24"/>
+                  </w:rPr>
+                </w:pPr>
+                <w:r>
+                  <w:rPr>
+                    <w:rtl w:val="0"/>
+                  </w:rPr>
+                </w:r>
+              </w:p>
+            </w:tc>
+            <w:tc>
+              <w:tcPr>
                 <w:tcMar>
                   <w:top w:w="0.0" w:type="dxa"/>
                   <w:left w:w="0.0" w:type="dxa"/>
@@ -1687,9 +1792,16 @@
                 <w:r>
                   <w:rPr>
                     <w:b w:val="1"/>
-                    <w:rtl w:val="0"/>
-                  </w:rPr>
-                  <w:t xml:space="preserve">Print Name:</w:t>
+                    <w:sz w:val="24"/>
+                    <w:szCs w:val="24"/>
+                    <w:rtl w:val="0"/>
+                  </w:rPr>
+                  <w:t xml:space="preserve">Co-Owner Name:</w:t>
+                </w:r>
+                <w:r>
+                  <w:rPr>
+                    <w:rtl w:val="0"/>
+                  </w:rPr>
                 </w:r>
               </w:p>
             </w:tc>
@@ -1717,12 +1829,15 @@
                   <w:rPr>
                     <w:rtl w:val="0"/>
                   </w:rPr>
-                  <w:t xml:space="preserve">{{PRINT_NAME}}</w:t>
-                </w:r>
-              </w:p>
-            </w:tc>
-            <w:tc>
-              <w:tcPr>
+                  <w:t xml:space="preserve">{{CO_OWNER_NAME}}</w:t>
+                </w:r>
+              </w:p>
+            </w:tc>
+            <w:tc>
+              <w:tcPr>
+                <w:tcBorders>
+                  <w:bottom w:color="000000" w:space="0" w:sz="0" w:val="nil"/>
+                </w:tcBorders>
                 <w:tcMar>
                   <w:top w:w="0.0" w:type="dxa"/>
                   <w:left w:w="0.0" w:type="dxa"/>
@@ -1745,7 +1860,7 @@
                     <w:b w:val="1"/>
                     <w:rtl w:val="0"/>
                   </w:rPr>
-                  <w:t xml:space="preserve">Date:</w:t>
+                  <w:t xml:space="preserve">Signature:</w:t>
                 </w:r>
               </w:p>
             </w:tc>
@@ -1767,6 +1882,61 @@
                   <w:widowControl w:val="0"/>
                   <w:spacing w:after="0" w:line="240" w:lineRule="auto"/>
                   <w:jc w:val="center"/>
+                  <w:rPr/>
+                </w:pPr>
+                <w:r>
+                  <w:rPr>
+                    <w:rtl w:val="0"/>
+                  </w:rPr>
+                </w:r>
+              </w:p>
+            </w:tc>
+            <w:tc>
+              <w:tcPr>
+                <w:tcMar>
+                  <w:top w:w="0.0" w:type="dxa"/>
+                  <w:left w:w="0.0" w:type="dxa"/>
+                  <w:bottom w:w="0.0" w:type="dxa"/>
+                  <w:right w:w="0.0" w:type="dxa"/>
+                </w:tcMar>
+                <w:vAlign w:val="bottom"/>
+              </w:tcPr>
+              <w:p>
+                <w:pPr>
+                  <w:widowControl w:val="0"/>
+                  <w:spacing w:after="0" w:line="240" w:lineRule="auto"/>
+                  <w:jc w:val="right"/>
+                  <w:rPr>
+                    <w:b w:val="1"/>
+                  </w:rPr>
+                </w:pPr>
+                <w:r>
+                  <w:rPr>
+                    <w:b w:val="1"/>
+                    <w:rtl w:val="0"/>
+                  </w:rPr>
+                  <w:t xml:space="preserve">Date:</w:t>
+                </w:r>
+              </w:p>
+            </w:tc>
+            <w:tc>
+              <w:tcPr>
+                <w:tcBorders>
+                  <w:bottom w:color="000000" w:space="0" w:sz="8" w:val="single"/>
+                </w:tcBorders>
+                <w:tcMar>
+                  <w:top w:w="0.0" w:type="dxa"/>
+                  <w:left w:w="0.0" w:type="dxa"/>
+                  <w:bottom w:w="0.0" w:type="dxa"/>
+                  <w:right w:w="0.0" w:type="dxa"/>
+                </w:tcMar>
+                <w:vAlign w:val="bottom"/>
+              </w:tcPr>
+              <w:p>
+                <w:pPr>
+                  <w:widowControl w:val="0"/>
+                  <w:spacing w:after="0" w:line="240" w:lineRule="auto"/>
+                  <w:jc w:val="center"/>
                   <w:rPr>
                     <w:sz w:val="24"/>
                     <w:szCs w:val="24"/>
@@ -1774,11 +1944,175 @@
                 </w:pPr>
                 <w:r>
                   <w:rPr>
+                    <w:rtl w:val="0"/>
+                  </w:rPr>
+                </w:r>
+              </w:p>
+            </w:tc>
+          </w:tr>
+          <w:tr>
+            <w:trPr>
+              <w:cantSplit w:val="0"/>
+              <w:tblHeader w:val="0"/>
+            </w:trPr>
+            <w:tc>
+              <w:tcPr>
+                <w:tcMar>
+                  <w:top w:w="0.0" w:type="dxa"/>
+                  <w:left w:w="0.0" w:type="dxa"/>
+                  <w:bottom w:w="0.0" w:type="dxa"/>
+                  <w:right w:w="0.0" w:type="dxa"/>
+                </w:tcMar>
+              </w:tcPr>
+              <w:p>
+                <w:pPr>
+                  <w:widowControl w:val="0"/>
+                  <w:spacing w:after="0" w:line="240" w:lineRule="auto"/>
+                  <w:jc w:val="right"/>
+                  <w:rPr>
+                    <w:b w:val="1"/>
+                    <w:sz w:val="18"/>
+                    <w:szCs w:val="18"/>
+                  </w:rPr>
+                </w:pPr>
+                <w:r>
+                  <w:rPr>
+                    <w:b w:val="1"/>
+                    <w:sz w:val="18"/>
+                    <w:szCs w:val="18"/>
+                    <w:rtl w:val="0"/>
+                  </w:rPr>
+                  <w:t xml:space="preserve">(If Applicable)</w:t>
+                </w:r>
+              </w:p>
+            </w:tc>
+            <w:tc>
+              <w:tcPr>
+                <w:tcMar>
+                  <w:top w:w="0.0" w:type="dxa"/>
+                  <w:left w:w="0.0" w:type="dxa"/>
+                  <w:bottom w:w="0.0" w:type="dxa"/>
+                  <w:right w:w="0.0" w:type="dxa"/>
+                </w:tcMar>
+                <w:vAlign w:val="bottom"/>
+              </w:tcPr>
+              <w:p>
+                <w:pPr>
+                  <w:widowControl w:val="0"/>
+                  <w:spacing w:after="0" w:line="240" w:lineRule="auto"/>
+                  <w:jc w:val="center"/>
+                  <w:rPr/>
+                </w:pPr>
+                <w:r>
+                  <w:rPr>
+                    <w:rtl w:val="0"/>
+                  </w:rPr>
+                </w:r>
+              </w:p>
+            </w:tc>
+            <w:tc>
+              <w:tcPr>
+                <w:tcBorders>
+                  <w:bottom w:color="000000" w:space="0" w:sz="0" w:val="nil"/>
+                </w:tcBorders>
+                <w:tcMar>
+                  <w:top w:w="0.0" w:type="dxa"/>
+                  <w:left w:w="0.0" w:type="dxa"/>
+                  <w:bottom w:w="0.0" w:type="dxa"/>
+                  <w:right w:w="0.0" w:type="dxa"/>
+                </w:tcMar>
+                <w:vAlign w:val="bottom"/>
+              </w:tcPr>
+              <w:p>
+                <w:pPr>
+                  <w:widowControl w:val="0"/>
+                  <w:spacing w:after="0" w:line="240" w:lineRule="auto"/>
+                  <w:jc w:val="right"/>
+                  <w:rPr>
+                    <w:b w:val="1"/>
+                  </w:rPr>
+                </w:pPr>
+                <w:r>
+                  <w:rPr>
+                    <w:rtl w:val="0"/>
+                  </w:rPr>
+                </w:r>
+              </w:p>
+            </w:tc>
+            <w:tc>
+              <w:tcPr>
+                <w:tcMar>
+                  <w:top w:w="0.0" w:type="dxa"/>
+                  <w:left w:w="0.0" w:type="dxa"/>
+                  <w:bottom w:w="0.0" w:type="dxa"/>
+                  <w:right w:w="0.0" w:type="dxa"/>
+                </w:tcMar>
+                <w:vAlign w:val="bottom"/>
+              </w:tcPr>
+              <w:p>
+                <w:pPr>
+                  <w:widowControl w:val="0"/>
+                  <w:spacing w:after="0" w:line="240" w:lineRule="auto"/>
+                  <w:jc w:val="center"/>
+                  <w:rPr/>
+                </w:pPr>
+                <w:r>
+                  <w:rPr>
+                    <w:rtl w:val="0"/>
+                  </w:rPr>
+                </w:r>
+              </w:p>
+            </w:tc>
+            <w:tc>
+              <w:tcPr>
+                <w:tcMar>
+                  <w:top w:w="0.0" w:type="dxa"/>
+                  <w:left w:w="0.0" w:type="dxa"/>
+                  <w:bottom w:w="0.0" w:type="dxa"/>
+                  <w:right w:w="0.0" w:type="dxa"/>
+                </w:tcMar>
+                <w:vAlign w:val="bottom"/>
+              </w:tcPr>
+              <w:p>
+                <w:pPr>
+                  <w:widowControl w:val="0"/>
+                  <w:spacing w:after="0" w:line="240" w:lineRule="auto"/>
+                  <w:jc w:val="right"/>
+                  <w:rPr>
+                    <w:b w:val="1"/>
+                  </w:rPr>
+                </w:pPr>
+                <w:r>
+                  <w:rPr>
+                    <w:rtl w:val="0"/>
+                  </w:rPr>
+                </w:r>
+              </w:p>
+            </w:tc>
+            <w:tc>
+              <w:tcPr>
+                <w:tcMar>
+                  <w:top w:w="0.0" w:type="dxa"/>
+                  <w:left w:w="0.0" w:type="dxa"/>
+                  <w:bottom w:w="0.0" w:type="dxa"/>
+                  <w:right w:w="0.0" w:type="dxa"/>
+                </w:tcMar>
+                <w:vAlign w:val="bottom"/>
+              </w:tcPr>
+              <w:p>
+                <w:pPr>
+                  <w:widowControl w:val="0"/>
+                  <w:spacing w:after="0" w:line="240" w:lineRule="auto"/>
+                  <w:jc w:val="center"/>
+                  <w:rPr>
                     <w:sz w:val="24"/>
                     <w:szCs w:val="24"/>
-                    <w:rtl w:val="0"/>
-                  </w:rPr>
-                  <w:t xml:space="preserve">{{DATE}}</w:t>
+                  </w:rPr>
+                </w:pPr>
+                <w:r>
+                  <w:rPr>
+                    <w:rtl w:val="0"/>
+                  </w:rPr>
                 </w:r>
               </w:p>
             </w:tc>

</xml_diff>